<commit_message>
SDIF: Shorts batch 1 Cowork brief; add fun bits to the podcast (Legend or Fact?, credit rating) and scope the no-asides rule to read-aloud parts
Co-Authored-By: Claude Opus 5.5 <noreply@anthropic.com>
Claude-Session: https://claude.ai/code/session_014ioKy9wXWAhWkhDM9PkABD
</commit_message>
<xml_diff>
--- a/Somebody Did It First - Cowork brief.docx
+++ b/Somebody Did It First - Cowork brief.docx
@@ -141,9 +141,9 @@
       </w:r>
     </w:p>
     <w:p>
-      <w:r>
-        <w:t xml:space="preserve">  - </w:t>
-      </w:r>
+      <w:pPr>
+        <w:pStyle w:val="ListBullet2"/>
+      </w:pPr>
       <w:r>
         <w:rPr>
           <w:b/>
@@ -155,9 +155,9 @@
       </w:r>
     </w:p>
     <w:p>
-      <w:r>
-        <w:t xml:space="preserve">  - </w:t>
-      </w:r>
+      <w:pPr>
+        <w:pStyle w:val="ListBullet2"/>
+      </w:pPr>
       <w:r>
         <w:rPr>
           <w:b/>
@@ -169,9 +169,9 @@
       </w:r>
     </w:p>
     <w:p>
-      <w:r>
-        <w:t xml:space="preserve">  - </w:t>
-      </w:r>
+      <w:pPr>
+        <w:pStyle w:val="ListBullet2"/>
+      </w:pPr>
       <w:r>
         <w:rPr>
           <w:b/>
@@ -222,9 +222,9 @@
       </w:r>
     </w:p>
     <w:p>
-      <w:r>
-        <w:t xml:space="preserve">  - </w:t>
-      </w:r>
+      <w:pPr>
+        <w:pStyle w:val="ListBullet2"/>
+      </w:pPr>
       <w:r>
         <w:rPr>
           <w:b/>
@@ -236,9 +236,9 @@
       </w:r>
     </w:p>
     <w:p>
-      <w:r>
-        <w:t xml:space="preserve">  - </w:t>
-      </w:r>
+      <w:pPr>
+        <w:pStyle w:val="ListBullet2"/>
+      </w:pPr>
       <w:r>
         <w:rPr>
           <w:b/>
@@ -250,9 +250,9 @@
       </w:r>
     </w:p>
     <w:p>
-      <w:r>
-        <w:t xml:space="preserve">  - </w:t>
-      </w:r>
+      <w:pPr>
+        <w:pStyle w:val="ListBullet2"/>
+      </w:pPr>
       <w:r>
         <w:rPr>
           <w:b/>
@@ -507,18 +507,35 @@
       </w:r>
     </w:p>
     <w:p>
+      <w:pPr>
+        <w:pStyle w:val="ListBullet2"/>
+      </w:pPr>
       <w:r>
-        <w:t xml:space="preserve">  - Plain talk; say each point once; trust the audience.</w:t>
+        <w:t>Plain talk; say each point once; trust the audience.</w:t>
       </w:r>
     </w:p>
     <w:p>
+      <w:pPr>
+        <w:pStyle w:val="ListBullet2"/>
+      </w:pPr>
       <w:r>
-        <w:t xml:space="preserve">  - No "right?", no narrator asides, no slogan lines.</w:t>
+        <w:t>No "right?", no narrator asides and no slogan lines in the read-aloud parts.</w:t>
       </w:r>
     </w:p>
     <w:p>
+      <w:pPr>
+        <w:pStyle w:val="ListBullet2"/>
+      </w:pPr>
       <w:r>
-        <w:t xml:space="preserve">  - Banned words: "genuinely", "dive in", "game changer", "unpack", "in today's video", "level up". No em dashes in spoken text.</w:t>
+        <w:t>The rest of the show should be fun: reactions, opinions and recurring bits (Legend or Fact?, the Stolen/Shared/Earned credit rating). Jokes never change the facts.</w:t>
+      </w:r>
+    </w:p>
+    <w:p>
+      <w:pPr>
+        <w:pStyle w:val="ListBullet2"/>
+      </w:pPr>
+      <w:r>
+        <w:t>Banned words: "genuinely", "dive in", "game changer", "unpack", "in today's video", "level up". No em dashes in spoken text.</w:t>
       </w:r>
     </w:p>
     <w:p>
@@ -1363,7 +1380,7 @@
     <w:rsid w:val="00FC693F"/>
     <w:rPr>
       <w:rFonts w:ascii="Calibri" w:hAnsi="Calibri"/>
-      <w:sz w:val="22"/>
+      <w:sz w:val="23"/>
     </w:rPr>
   </w:style>
   <w:style w:type="paragraph" w:styleId="Header">

</xml_diff>